<commit_message>
Documentation Nifty Index sheet 30 cols done
</commit_message>
<xml_diff>
--- a/Documentation/Nifty Index Sheet Column Explanation.docx
+++ b/Documentation/Nifty Index Sheet Column Explanation.docx
@@ -916,13 +916,8 @@
     </w:p>
     <w:p>
       <w:r>
-        <w:t xml:space="preserve">Last </w:t>
-      </w:r>
-      <w:proofErr w:type="spellStart"/>
-      <w:r>
-        <w:t>months</w:t>
-      </w:r>
-      <w:proofErr w:type="spellEnd"/>
+        <w:t>Last months</w:t>
+      </w:r>
       <w:r>
         <w:t xml:space="preserve"> closing price is taken as current months price until it changes to next month n then in same way when the current month changes to next month then current months closing price is taken as next months price until it changes to next to next month. </w:t>
       </w:r>
@@ -943,15 +938,7 @@
         <w:t xml:space="preserve"> </w:t>
       </w:r>
       <w:r>
-        <w:t xml:space="preserve">IF(K2&lt;&gt;K3, E3, F3) — if month changes, use </w:t>
-      </w:r>
-      <w:proofErr w:type="spellStart"/>
-      <w:r>
-        <w:t>prev</w:t>
-      </w:r>
-      <w:proofErr w:type="spellEnd"/>
-      <w:r>
-        <w:t xml:space="preserve"> close; else carry forward</w:t>
+        <w:t>IF(K2&lt;&gt;K3, E3, F3) — if month changes, use prev close; else carry forward</w:t>
       </w:r>
     </w:p>
     <w:p>
@@ -1297,13 +1284,7 @@
         <w:t xml:space="preserve">Formula </w:t>
       </w:r>
       <w:r>
-        <w:t>=IF(MONTH(A</w:t>
-      </w:r>
-      <w:r>
-        <w:t>2) &lt;</w:t>
-      </w:r>
-      <w:r>
-        <w:t>&gt;MONTH(A3), 1, 1+I3)</w:t>
+        <w:t>=IF(MONTH(A2) &lt;&gt;MONTH(A3), 1, 1+I3)</w:t>
       </w:r>
     </w:p>
     <w:p>
@@ -1428,7 +1409,6 @@
         </w:rPr>
         <w:t xml:space="preserve">11]. </w:t>
       </w:r>
-      <w:proofErr w:type="spellStart"/>
       <w:r>
         <w:rPr>
           <w:b/>
@@ -1436,7 +1416,6 @@
         </w:rPr>
         <w:t>Mth</w:t>
       </w:r>
-      <w:proofErr w:type="spellEnd"/>
       <w:r>
         <w:rPr>
           <w:b/>
@@ -1538,7 +1517,6 @@
         </w:rPr>
         <w:t xml:space="preserve">12]. </w:t>
       </w:r>
-      <w:proofErr w:type="spellStart"/>
       <w:r>
         <w:rPr>
           <w:b/>
@@ -1546,7 +1524,6 @@
         </w:rPr>
         <w:t>DoW</w:t>
       </w:r>
-      <w:proofErr w:type="spellEnd"/>
       <w:r>
         <w:rPr>
           <w:b/>
@@ -2357,21 +2334,12 @@
         </w:rPr>
         <w:t xml:space="preserve">   </w:t>
       </w:r>
-      <w:proofErr w:type="spellStart"/>
-      <w:r>
-        <w:rPr>
-          <w:b/>
-          <w:bCs/>
-        </w:rPr>
-        <w:t>Gap</w:t>
-      </w:r>
-      <w:proofErr w:type="spellEnd"/>
-      <w:r>
-        <w:rPr>
-          <w:b/>
-          <w:bCs/>
-        </w:rPr>
-        <w:t xml:space="preserve"> type classification (FGU/GU/FGD/GD)</w:t>
+      <w:r>
+        <w:rPr>
+          <w:b/>
+          <w:bCs/>
+        </w:rPr>
+        <w:t>Gap type classification (FGU/GU/FGD/GD)</w:t>
       </w:r>
     </w:p>
     <w:p>
@@ -2497,7 +2465,6 @@
         </w:rPr>
         <w:t xml:space="preserve">17]. </w:t>
       </w:r>
-      <w:proofErr w:type="spellStart"/>
       <w:r>
         <w:rPr>
           <w:b/>
@@ -2505,7 +2472,6 @@
         </w:rPr>
         <w:t>Cdl</w:t>
       </w:r>
-      <w:proofErr w:type="spellEnd"/>
       <w:r>
         <w:rPr>
           <w:b/>
@@ -2580,15 +2546,7 @@
     </w:p>
     <w:p>
       <w:r>
-        <w:t xml:space="preserve">Candle pattern analysis. Large positive </w:t>
-      </w:r>
-      <w:proofErr w:type="spellStart"/>
-      <w:r>
-        <w:t>Cdl</w:t>
-      </w:r>
-      <w:proofErr w:type="spellEnd"/>
-      <w:r>
-        <w:t xml:space="preserve"> + high volume = strong bullish day.</w:t>
+        <w:t>Candle pattern analysis. Large positive Cdl + high volume = strong bullish day.</w:t>
       </w:r>
     </w:p>
     <w:p>
@@ -3001,31 +2959,13 @@
         </w:rPr>
         <w:t xml:space="preserve">20]. </w:t>
       </w:r>
-      <w:proofErr w:type="spellStart"/>
-      <w:r>
-        <w:rPr>
-          <w:b/>
-          <w:bCs/>
-        </w:rPr>
-        <w:t>Cdl</w:t>
-      </w:r>
-      <w:proofErr w:type="spellEnd"/>
-      <w:r>
-        <w:rPr>
-          <w:b/>
-          <w:bCs/>
-        </w:rPr>
-        <w:t xml:space="preserve"> </w:t>
-      </w:r>
-      <w:proofErr w:type="spellStart"/>
-      <w:r>
-        <w:rPr>
-          <w:b/>
-          <w:bCs/>
-        </w:rPr>
-        <w:t>Seq</w:t>
-      </w:r>
-      <w:proofErr w:type="spellEnd"/>
+      <w:r>
+        <w:rPr>
+          <w:b/>
+          <w:bCs/>
+        </w:rPr>
+        <w:t>Cdl Seq</w:t>
+      </w:r>
     </w:p>
     <w:p>
       <w:r>
@@ -3122,23 +3062,7 @@
     </w:p>
     <w:p>
       <w:r>
-        <w:t xml:space="preserve">Q – </w:t>
-      </w:r>
-      <w:proofErr w:type="spellStart"/>
-      <w:r>
-        <w:t>Cld</w:t>
-      </w:r>
-      <w:proofErr w:type="spellEnd"/>
-      <w:r>
-        <w:t xml:space="preserve"> Column, T – </w:t>
-      </w:r>
-      <w:proofErr w:type="spellStart"/>
-      <w:r>
-        <w:t>Cdl</w:t>
-      </w:r>
-      <w:proofErr w:type="spellEnd"/>
-      <w:r>
-        <w:t xml:space="preserve"> sequence column itself</w:t>
+        <w:t>Q – Cld Column, T – Cdl sequence column itself</w:t>
       </w:r>
     </w:p>
     <w:p>
@@ -3175,6 +3099,13 @@
           <w:b/>
           <w:bCs/>
         </w:rPr>
+        <w:t xml:space="preserve">21]. </w:t>
+      </w:r>
+      <w:r>
+        <w:rPr>
+          <w:b/>
+          <w:bCs/>
+        </w:rPr>
         <w:t>std20</w:t>
       </w:r>
     </w:p>
@@ -3185,7 +3116,25 @@
     </w:p>
     <w:p>
       <w:r>
-        <w:t>Formula concept: Daily return ÷ 20-day standard deviation.</w:t>
+        <w:t>formula is: std20 = LN(Close_today / Close_yesterday) × 100 / STDEVP(last 20 Ln values)</w:t>
+      </w:r>
+    </w:p>
+    <w:p>
+      <w:r>
+        <w:t xml:space="preserve">Formula </w:t>
+      </w:r>
+      <w:r>
+        <w:t>=AC2*100/STDEVP(AC2:AC21)</w:t>
+      </w:r>
+    </w:p>
+    <w:p>
+      <w:r>
+        <w:t>AC = Log i. e. ln(Current day’s close/previous day’s close)</w:t>
+      </w:r>
+    </w:p>
+    <w:p>
+      <w:r>
+        <w:t>This is a z-score — a single number that answers: "Was today's move normal or extraordinary, given how volatile the market has been recently?"</w:t>
       </w:r>
     </w:p>
     <w:p>
@@ -3239,6 +3188,14 @@
           <w:b/>
           <w:bCs/>
         </w:rPr>
+        <w:lastRenderedPageBreak/>
+        <w:t xml:space="preserve">22]. </w:t>
+      </w:r>
+      <w:r>
+        <w:rPr>
+          <w:b/>
+          <w:bCs/>
+        </w:rPr>
         <w:t>std50</w:t>
       </w:r>
     </w:p>
@@ -3249,6 +3206,19 @@
     </w:p>
     <w:p>
       <w:r>
+        <w:t xml:space="preserve">Formula : </w:t>
+      </w:r>
+      <w:r>
+        <w:t>=AC2*100/STDEVP(AC2:AC51)</w:t>
+      </w:r>
+    </w:p>
+    <w:p>
+      <w:r>
+        <w:t>Same as std20 but uses the 50-day standard deviation. A longer-window normalisation giving slower-moving context.</w:t>
+      </w:r>
+    </w:p>
+    <w:p>
+      <w:r>
         <w:t>Purpose:</w:t>
       </w:r>
     </w:p>
@@ -3271,7 +3241,6 @@
         </w:numPr>
       </w:pPr>
       <w:r>
-        <w:lastRenderedPageBreak/>
         <w:t>Smoother than std20.</w:t>
       </w:r>
     </w:p>
@@ -3309,6 +3278,13 @@
           <w:b/>
           <w:bCs/>
         </w:rPr>
+        <w:t xml:space="preserve">23]. </w:t>
+      </w:r>
+      <w:r>
+        <w:rPr>
+          <w:b/>
+          <w:bCs/>
+        </w:rPr>
         <w:t>5dma</w:t>
       </w:r>
     </w:p>
@@ -3324,6 +3300,17 @@
     </w:p>
     <w:p>
       <w:r>
+        <w:t xml:space="preserve">= </w:t>
+      </w:r>
+      <w:r>
+        <w:t>E2*100/AVERAGE(E2:E6)</w:t>
+      </w:r>
+      <w:r>
+        <w:t>, E2 – Current days close</w:t>
+      </w:r>
+    </w:p>
+    <w:p>
+      <w:r>
         <w:t>Purpose:</w:t>
       </w:r>
     </w:p>
@@ -3347,6 +3334,20 @@
       </w:pPr>
       <w:r>
         <w:t>Detects immediate overextension.</w:t>
+      </w:r>
+    </w:p>
+    <w:p>
+      <w:r>
+        <w:t xml:space="preserve">At </w:t>
+      </w:r>
+      <w:r>
+        <w:t xml:space="preserve">100 </w:t>
+      </w:r>
+      <w:r>
+        <w:t xml:space="preserve">: </w:t>
+      </w:r>
+      <w:r>
+        <w:t>price exactly at the 5-day MA</w:t>
       </w:r>
     </w:p>
     <w:p>
@@ -3378,6 +3379,13 @@
           <w:b/>
           <w:bCs/>
         </w:rPr>
+        <w:t xml:space="preserve">24]. </w:t>
+      </w:r>
+      <w:r>
+        <w:rPr>
+          <w:b/>
+          <w:bCs/>
+        </w:rPr>
         <w:t>20dma</w:t>
       </w:r>
     </w:p>
@@ -3388,6 +3396,14 @@
     </w:p>
     <w:p>
       <w:r>
+        <w:t xml:space="preserve">Formula : </w:t>
+      </w:r>
+      <w:r>
+        <w:t>=E2*100/AVERAGE(E2:E21)</w:t>
+      </w:r>
+    </w:p>
+    <w:p>
+      <w:r>
         <w:t>Purpose:</w:t>
       </w:r>
     </w:p>
@@ -3411,6 +3427,11 @@
       </w:pPr>
       <w:r>
         <w:t>Common institutional trend reference.</w:t>
+      </w:r>
+    </w:p>
+    <w:p>
+      <w:r>
+        <w:t>Standard swing-trading MA. The '20 MA' referenced in most technical analysis literature.</w:t>
       </w:r>
     </w:p>
     <w:p>
@@ -3432,12 +3453,34 @@
           <w:b/>
           <w:bCs/>
         </w:rPr>
+        <w:t xml:space="preserve">25]. </w:t>
+      </w:r>
+      <w:r>
+        <w:rPr>
+          <w:b/>
+          <w:bCs/>
+        </w:rPr>
         <w:t>50dma</w:t>
       </w:r>
     </w:p>
     <w:p>
       <w:r>
         <w:t>Current Close compared to 50DMA.</w:t>
+      </w:r>
+    </w:p>
+    <w:p>
+      <w:r>
+        <w:lastRenderedPageBreak/>
+        <w:t xml:space="preserve">Formula : </w:t>
+      </w:r>
+      <w:r>
+        <w:t>=</w:t>
+      </w:r>
+      <w:r>
+        <w:t xml:space="preserve"> </w:t>
+      </w:r>
+      <w:r>
+        <w:t>E2*100/AVERAGE(E2:E51)</w:t>
       </w:r>
     </w:p>
     <w:p>
@@ -3486,6 +3529,13 @@
           <w:b/>
           <w:bCs/>
         </w:rPr>
+        <w:t xml:space="preserve">26]. </w:t>
+      </w:r>
+      <w:r>
+        <w:rPr>
+          <w:b/>
+          <w:bCs/>
+        </w:rPr>
         <w:t>200DMA</w:t>
       </w:r>
     </w:p>
@@ -3496,6 +3546,14 @@
     </w:p>
     <w:p>
       <w:r>
+        <w:t xml:space="preserve">Formula : </w:t>
+      </w:r>
+      <w:r>
+        <w:t>=E2*100/AVERAGE(E2:E201)</w:t>
+      </w:r>
+    </w:p>
+    <w:p>
+      <w:r>
         <w:t>Purpose:</w:t>
       </w:r>
     </w:p>
@@ -3533,7 +3591,6 @@
     </w:p>
     <w:p>
       <w:r>
-        <w:lastRenderedPageBreak/>
         <w:pict w14:anchorId="291335D6">
           <v:rect id="_x0000_i1051" style="width:0;height:1.5pt" o:hralign="center" o:hrstd="t" o:hr="t" fillcolor="#a0a0a0" stroked="f"/>
         </w:pict>
@@ -3551,12 +3608,27 @@
           <w:b/>
           <w:bCs/>
         </w:rPr>
+        <w:t xml:space="preserve">27]. </w:t>
+      </w:r>
+      <w:r>
+        <w:rPr>
+          <w:b/>
+          <w:bCs/>
+        </w:rPr>
         <w:t>100-DMA</w:t>
       </w:r>
     </w:p>
     <w:p>
       <w:r>
         <w:t>Current Close compared to 100DMA.</w:t>
+      </w:r>
+    </w:p>
+    <w:p>
+      <w:r>
+        <w:t xml:space="preserve">Formula : </w:t>
+      </w:r>
+      <w:r>
+        <w:t>=E2*100/AVERAGE(E2:E101)</w:t>
       </w:r>
     </w:p>
     <w:p>
@@ -3620,6 +3692,13 @@
           <w:b/>
           <w:bCs/>
         </w:rPr>
+        <w:t xml:space="preserve">28]. </w:t>
+      </w:r>
+      <w:r>
+        <w:rPr>
+          <w:b/>
+          <w:bCs/>
+        </w:rPr>
         <w:t>HV</w:t>
       </w:r>
     </w:p>
@@ -3635,6 +3714,14 @@
     </w:p>
     <w:p>
       <w:r>
+        <w:t xml:space="preserve">   </w:t>
+      </w:r>
+      <w:r>
+        <w:t>=STDEVP(AC2:AC21)*100*SQRT(250)</w:t>
+      </w:r>
+    </w:p>
+    <w:p>
+      <w:r>
         <w:t>Purpose:</w:t>
       </w:r>
     </w:p>
@@ -3678,6 +3765,7 @@
     </w:p>
     <w:p>
       <w:r>
+        <w:lastRenderedPageBreak/>
         <w:t>Lower HV: Market consolidating.</w:t>
       </w:r>
     </w:p>
@@ -3700,7 +3788,28 @@
           <w:b/>
           <w:bCs/>
         </w:rPr>
+        <w:t xml:space="preserve">29]. </w:t>
+      </w:r>
+      <w:r>
+        <w:rPr>
+          <w:b/>
+          <w:bCs/>
+        </w:rPr>
         <w:t>Ln</w:t>
+      </w:r>
+      <w:r>
+        <w:rPr>
+          <w:b/>
+          <w:bCs/>
+        </w:rPr>
+        <w:t xml:space="preserve"> </w:t>
+      </w:r>
+      <w:r>
+        <w:rPr>
+          <w:b/>
+          <w:bCs/>
+        </w:rPr>
+        <w:t>Log return: ln(Close / prev Close)</w:t>
       </w:r>
     </w:p>
     <w:p>
@@ -3770,6 +3879,13 @@
           <w:b/>
           <w:bCs/>
         </w:rPr>
+        <w:t xml:space="preserve">30]. </w:t>
+      </w:r>
+      <w:r>
+        <w:rPr>
+          <w:b/>
+          <w:bCs/>
+        </w:rPr>
         <w:t>HV(20)/HV(250)</w:t>
       </w:r>
     </w:p>
@@ -3780,6 +3896,19 @@
     </w:p>
     <w:p>
       <w:r>
+        <w:t xml:space="preserve">Formula : </w:t>
+      </w:r>
+      <w:r>
+        <w:t>=STDEVP(AC2:AC21)*100/STDEVP(AC2:AC251)</w:t>
+      </w:r>
+    </w:p>
+    <w:p>
+      <w:r>
+        <w:t>AC column is ln(current day close/Previous day’s close)</w:t>
+      </w:r>
+    </w:p>
+    <w:p>
+      <w:r>
         <w:t>Purpose:</w:t>
       </w:r>
     </w:p>
@@ -3795,13 +3924,87 @@
       </w:r>
     </w:p>
     <w:p>
+      <w:pPr>
+        <w:numPr>
+          <w:ilvl w:val="0"/>
+          <w:numId w:val="38"/>
+        </w:numPr>
+      </w:pPr>
+      <w:r>
+        <w:t>Compares short-term realised vol to long-term average vol. &gt;1 = vol currently elevated vs history, &lt;1 = suppressed.</w:t>
+      </w:r>
+    </w:p>
+    <w:p>
+      <w:pPr>
+        <w:shd w:val="clear" w:color="auto" w:fill="FFFFFF"/>
+        <w:spacing w:after="30" w:line="240" w:lineRule="auto"/>
+        <w:rPr>
+          <w:rFonts w:ascii="Arial" w:eastAsia="Times New Roman" w:hAnsi="Arial" w:cs="Arial"/>
+          <w:caps/>
+          <w:color w:val="73726C"/>
+          <w:spacing w:val="10"/>
+          <w:kern w:val="0"/>
+          <w:sz w:val="17"/>
+          <w:szCs w:val="17"/>
+          <w:lang w:eastAsia="en-IN"/>
+          <w14:ligatures w14:val="none"/>
+        </w:rPr>
+      </w:pPr>
+      <w:r>
+        <w:rPr>
+          <w:rFonts w:ascii="Arial" w:eastAsia="Times New Roman" w:hAnsi="Arial" w:cs="Arial"/>
+          <w:caps/>
+          <w:color w:val="73726C"/>
+          <w:spacing w:val="10"/>
+          <w:kern w:val="0"/>
+          <w:sz w:val="17"/>
+          <w:szCs w:val="17"/>
+          <w:lang w:eastAsia="en-IN"/>
+          <w14:ligatures w14:val="none"/>
+        </w:rPr>
+        <w:t>When to use</w:t>
+      </w:r>
+    </w:p>
+    <w:p>
+      <w:pPr>
+        <w:pStyle w:val="ListParagraph"/>
+        <w:numPr>
+          <w:ilvl w:val="0"/>
+          <w:numId w:val="38"/>
+        </w:numPr>
+        <w:shd w:val="clear" w:color="auto" w:fill="FFFFFF"/>
+        <w:spacing w:after="0" w:line="240" w:lineRule="auto"/>
+        <w:rPr>
+          <w:rFonts w:ascii="Arial" w:eastAsia="Times New Roman" w:hAnsi="Arial" w:cs="Arial"/>
+          <w:color w:val="3D3D3A"/>
+          <w:kern w:val="0"/>
+          <w:sz w:val="18"/>
+          <w:szCs w:val="18"/>
+          <w:lang w:eastAsia="en-IN"/>
+          <w14:ligatures w14:val="none"/>
+        </w:rPr>
+      </w:pPr>
+      <w:r>
+        <w:rPr>
+          <w:rFonts w:ascii="Arial" w:eastAsia="Times New Roman" w:hAnsi="Arial" w:cs="Arial"/>
+          <w:color w:val="3D3D3A"/>
+          <w:kern w:val="0"/>
+          <w:sz w:val="18"/>
+          <w:szCs w:val="18"/>
+          <w:lang w:eastAsia="en-IN"/>
+          <w14:ligatures w14:val="none"/>
+        </w:rPr>
+        <w:t>Vol regime detection. Ratio &gt;1.5 = high-vol regime (buy options / reduce position). Ratio &lt;0.7 = low-vol regime (sell options / increase position).</w:t>
+      </w:r>
+    </w:p>
+    <w:p/>
+    <w:p>
       <w:r>
         <w:t>Interpretation:</w:t>
       </w:r>
     </w:p>
     <w:p>
       <w:r>
-        <w:lastRenderedPageBreak/>
         <w:t>1 = recent volatility higher than long-term volatility.</w:t>
       </w:r>
     </w:p>
@@ -3892,6 +4095,7 @@
         </w:numPr>
       </w:pPr>
       <w:r>
+        <w:lastRenderedPageBreak/>
         <w:t>Number of calendar days remaining for expiry.</w:t>
       </w:r>
     </w:p>
@@ -4023,7 +4227,6 @@
           <w:bCs/>
         </w:rPr>
       </w:pPr>
-      <w:proofErr w:type="spellStart"/>
       <w:r>
         <w:rPr>
           <w:b/>
@@ -4031,7 +4234,6 @@
         </w:rPr>
         <w:t>frml</w:t>
       </w:r>
-      <w:proofErr w:type="spellEnd"/>
     </w:p>
     <w:p>
       <w:r>
@@ -4083,7 +4285,6 @@
     </w:p>
     <w:p>
       <w:r>
-        <w:lastRenderedPageBreak/>
         <w:pict w14:anchorId="2E7C7302">
           <v:rect id="_x0000_i1058" style="width:0;height:1.5pt" o:hralign="center" o:hrstd="t" o:hr="t" fillcolor="#a0a0a0" stroked="f"/>
         </w:pict>
@@ -4168,6 +4369,7 @@
     </w:p>
     <w:p>
       <w:r>
+        <w:lastRenderedPageBreak/>
         <w:t>Meaning: Volatility expansion.</w:t>
       </w:r>
     </w:p>
@@ -4212,7 +4414,6 @@
           <w:bCs/>
         </w:rPr>
       </w:pPr>
-      <w:proofErr w:type="spellStart"/>
       <w:r>
         <w:rPr>
           <w:b/>
@@ -4220,7 +4421,6 @@
         </w:rPr>
         <w:t>Rng</w:t>
       </w:r>
-      <w:proofErr w:type="spellEnd"/>
     </w:p>
     <w:p>
       <w:r>
@@ -4359,7 +4559,6 @@
     </w:p>
     <w:p>
       <w:r>
-        <w:lastRenderedPageBreak/>
         <w:t>Purpose:</w:t>
       </w:r>
     </w:p>
@@ -4452,6 +4651,7 @@
         </w:numPr>
       </w:pPr>
       <w:r>
+        <w:lastRenderedPageBreak/>
         <w:t>FGD = Full Gap Down</w:t>
       </w:r>
     </w:p>
@@ -4627,7 +4827,6 @@
     </w:p>
     <w:p>
       <w:r>
-        <w:lastRenderedPageBreak/>
         <w:t>Close position inside daily range.</w:t>
       </w:r>
     </w:p>
@@ -4702,6 +4901,7 @@
         </w:numPr>
       </w:pPr>
       <w:r>
+        <w:lastRenderedPageBreak/>
         <w:t>CAH = Close Above High</w:t>
       </w:r>
     </w:p>
@@ -4909,7 +5109,6 @@
         </w:numPr>
       </w:pPr>
       <w:r>
-        <w:lastRenderedPageBreak/>
         <w:t>Statistical market behaviour</w:t>
       </w:r>
     </w:p>
@@ -5014,6 +5213,7 @@
           <w:b/>
           <w:bCs/>
         </w:rPr>
+        <w:lastRenderedPageBreak/>
         <w:t>IMPORTANT OBSERVATION</w:t>
       </w:r>
     </w:p>
@@ -5346,7 +5546,6 @@
           </w:tcPr>
           <w:p>
             <w:r>
-              <w:lastRenderedPageBreak/>
               <w:t>Gap</w:t>
             </w:r>
           </w:p>
@@ -5375,11 +5574,9 @@
             <w:hideMark/>
           </w:tcPr>
           <w:p>
-            <w:proofErr w:type="spellStart"/>
             <w:r>
               <w:t>Cdl</w:t>
             </w:r>
-            <w:proofErr w:type="spellEnd"/>
           </w:p>
         </w:tc>
         <w:tc>
@@ -5610,6 +5807,7 @@
           </w:tcPr>
           <w:p>
             <w:r>
+              <w:lastRenderedPageBreak/>
               <w:t>Gaps</w:t>
             </w:r>
           </w:p>
@@ -5680,53 +5878,21 @@
     </w:p>
     <w:p>
       <w:r>
-        <w:t>=IF(Close&gt;</w:t>
-      </w:r>
-      <w:proofErr w:type="spellStart"/>
-      <w:r>
-        <w:t>PrevClose</w:t>
-      </w:r>
-      <w:proofErr w:type="spellEnd"/>
-      <w:r>
-        <w:t>,</w:t>
+        <w:t>=IF(Close&gt;PrevClose,</w:t>
       </w:r>
       <w:r>
         <w:t xml:space="preserve"> </w:t>
       </w:r>
       <w:r>
-        <w:t>IF(</w:t>
-      </w:r>
-      <w:proofErr w:type="spellStart"/>
-      <w:r>
-        <w:t>PrevValue</w:t>
-      </w:r>
-      <w:proofErr w:type="spellEnd"/>
-      <w:r>
-        <w:t>&gt;0,PrevValue+1,1),</w:t>
+        <w:t>IF(PrevValue&gt;0,PrevValue+1,1),</w:t>
       </w:r>
       <w:r>
         <w:br/>
-        <w:t>IF(Close&lt;</w:t>
-      </w:r>
-      <w:proofErr w:type="spellStart"/>
-      <w:r>
-        <w:t>PrevClose</w:t>
-      </w:r>
-      <w:proofErr w:type="spellEnd"/>
-      <w:r>
-        <w:t>,</w:t>
+        <w:t>IF(Close&lt;PrevClose,</w:t>
       </w:r>
       <w:r>
         <w:br/>
-        <w:t>IF(</w:t>
-      </w:r>
-      <w:proofErr w:type="spellStart"/>
-      <w:r>
-        <w:t>PrevValue</w:t>
-      </w:r>
-      <w:proofErr w:type="spellEnd"/>
-      <w:r>
-        <w:t>&lt;0,PrevValue-1,-1),</w:t>
+        <w:t>IF(PrevValue&lt;0,PrevValue-1,-1),</w:t>
       </w:r>
       <w:r>
         <w:br/>
@@ -5961,6 +6127,7 @@
     </w:p>
     <w:p>
       <w:r>
+        <w:lastRenderedPageBreak/>
         <w:t>105100=1.05\frac{105}{100} = 1.05100105</w:t>
       </w:r>
       <w:r>
@@ -6067,23 +6234,7 @@
     </w:p>
     <w:p>
       <w:r>
-        <w:t>(Current </w:t>
-      </w:r>
-      <w:proofErr w:type="spellStart"/>
-      <w:r>
-        <w:t>ClosePrevious</w:t>
-      </w:r>
-      <w:proofErr w:type="spellEnd"/>
-      <w:r>
-        <w:t> Close−1)×100\left(\frac{\text{Current Close}}{\text{Previous Close}}-1\right)\times100(Previous </w:t>
-      </w:r>
-      <w:proofErr w:type="spellStart"/>
-      <w:r>
-        <w:t>CloseCurrent</w:t>
-      </w:r>
-      <w:proofErr w:type="spellEnd"/>
-      <w:r>
-        <w:t> Close</w:t>
+        <w:t>(Current ClosePrevious Close−1)×100\left(\frac{\text{Current Close}}{\text{Previous Close}}-1\right)\times100(Previous CloseCurrent Close</w:t>
       </w:r>
       <w:r>
         <w:rPr>
@@ -6098,7 +6249,7 @@
     <w:p>
       <w:r>
         <w:pict w14:anchorId="28FEA7FC">
-          <v:rect id="_x0000_i1086" style="width:0;height:1.5pt" o:hralign="center" o:hrstd="t" o:hr="t" fillcolor="#a0a0a0" stroked="f"/>
+          <v:rect id="_x0000_i1068" style="width:0;height:1.5pt" o:hralign="center" o:hrstd="t" o:hr="t" fillcolor="#a0a0a0" stroked="f"/>
         </w:pict>
       </w:r>
     </w:p>
@@ -6124,23 +6275,7 @@
     </w:p>
     <w:p>
       <w:r>
-        <w:t>New </w:t>
-      </w:r>
-      <w:proofErr w:type="spellStart"/>
-      <w:r>
-        <w:t>ValueOld</w:t>
-      </w:r>
-      <w:proofErr w:type="spellEnd"/>
-      <w:r>
-        <w:t> Value\frac{\text{New Value}}{\text{Old Value}}Old </w:t>
-      </w:r>
-      <w:proofErr w:type="spellStart"/>
-      <w:r>
-        <w:t>ValueNew</w:t>
-      </w:r>
-      <w:proofErr w:type="spellEnd"/>
-      <w:r>
-        <w:t> Value</w:t>
+        <w:t>New ValueOld Value\frac{\text{New Value}}{\text{Old Value}}Old ValueNew Value</w:t>
       </w:r>
       <w:r>
         <w:rPr>
@@ -6164,7 +6299,6 @@
     </w:p>
     <w:p>
       <w:r>
-        <w:lastRenderedPageBreak/>
         <w:t>Examples:</w:t>
       </w:r>
     </w:p>
@@ -6388,7 +6522,7 @@
     <w:p>
       <w:r>
         <w:pict w14:anchorId="4C7F355B">
-          <v:rect id="_x0000_i1087" style="width:0;height:1.5pt" o:hralign="center" o:hrstd="t" o:hr="t" fillcolor="#a0a0a0" stroked="f"/>
+          <v:rect id="_x0000_i1069" style="width:0;height:1.5pt" o:hralign="center" o:hrstd="t" o:hr="t" fillcolor="#a0a0a0" stroked="f"/>
         </w:pict>
       </w:r>
     </w:p>
@@ -6404,6 +6538,7 @@
           <w:b/>
           <w:bCs/>
         </w:rPr>
+        <w:lastRenderedPageBreak/>
         <w:t>Example of price fall</w:t>
       </w:r>
     </w:p>
@@ -6458,7 +6593,7 @@
     <w:p>
       <w:r>
         <w:pict w14:anchorId="472EB07C">
-          <v:rect id="_x0000_i1088" style="width:0;height:1.5pt" o:hralign="center" o:hrstd="t" o:hr="t" fillcolor="#a0a0a0" stroked="f"/>
+          <v:rect id="_x0000_i1070" style="width:0;height:1.5pt" o:hralign="center" o:hrstd="t" o:hr="t" fillcolor="#a0a0a0" stroked="f"/>
         </w:pict>
       </w:r>
     </w:p>

</xml_diff>